<commit_message>
Keep the full local notes out of the upload and publish the copy without company identifiers.
Co-authored-by: Cursor <cursoragent@cursor.com>
</commit_message>
<xml_diff>
--- a/发布/归档/产量成本模拟器-重要图表汇编 (2).docx
+++ b/发布/归档/产量成本模拟器-重要图表汇编 (2).docx
@@ -121,7 +121,7 @@
           <w:color w:val="C00000"/>
           <w:sz w:val="21"/>
         </w:rPr>
-        <w:t>说明：本汇编中的图均为示例结构 / 示例数据（来自 AI &amp; Data 组自建原型及讨论稿），非沃尔沃真实数据、非真实系统设计；标 ⚠ 的内容需与业务部门确认。</w:t>
+        <w:t>说明：本汇编中的图均为示例结构 / 示例数据（来自 AI &amp; Data 组自建原型及讨论稿），非工厂实绩、非真实系统设计；标 ⚠ 的内容需与业务部门确认。</w:t>
       </w:r>
     </w:p>
     <w:p>
@@ -1232,7 +1232,7 @@
           <w:b w:val="0"/>
           <w:sz w:val="19"/>
         </w:rPr>
-        <w:t>要点：基准方案以「中档 JPH + 两班」为主，旺季升档；全部为示例数据，不是沃尔沃真实数据。</w:t>
+        <w:t>要点：基准方案以「中档 JPH + 两班」为主，旺季升档；全部为示例数据，不是工厂实绩。</w:t>
       </w:r>
     </w:p>
     <w:p>
@@ -1811,7 +1811,7 @@
                 <w:rFonts w:ascii="微软雅黑" w:hAnsi="微软雅黑" w:eastAsia="微软雅黑"/>
                 <w:sz w:val="18"/>
               </w:rPr>
-              <w:t>E 波次推广：W0 台州试点 → W1 1 个相近工厂 → W2 2–3 个工厂 → W3 其余工厂。F 需求回流：各厂需求经变更评审（通用进核心，本厂特有进配置包）后发布新核心版本，各厂回归测试后升级。C 组织与 AI 加速贯穿全程，AI 只提建议、人确认。</w:t>
+              <w:t>E 波次推广：W0 示例工厂试点 → W1 1 个相近工厂 → W2 2–3 个工厂 → W3 其余工厂。F 需求回流：各厂需求经变更评审（通用进核心，本厂特有进配置包）后发布新核心版本，各厂回归测试后升级。C 组织与 AI 加速贯穿全程，AI 只提建议、人确认。</w:t>
             </w:r>
           </w:p>
           <w:p>
@@ -1823,7 +1823,7 @@
                 <w:rFonts w:ascii="微软雅黑" w:hAnsi="微软雅黑" w:eastAsia="微软雅黑"/>
                 <w:sz w:val="18"/>
               </w:rPr>
-              <w:t>要点：换工厂只换配置，不改代码。工期、人天、波次和就绪度口径均为示例 ⚠，需在台州试点结束后按实际投入校准。</w:t>
+              <w:t>要点：换工厂只换配置，不改代码。工期、人天、波次和就绪度口径均为示例 ⚠，需在示例工厂试点结束后按实际投入校准。</w:t>
             </w:r>
           </w:p>
         </w:tc>

</xml_diff>